<commit_message>
Update  Phase 7 document formatting
</commit_message>
<xml_diff>
--- a/Phase 7 - Project Documentation/Phase 7 - Project Documentation.docx
+++ b/Phase 7 - Project Documentation/Phase 7 - Project Documentation.docx
@@ -6,14 +6,20 @@
       <w:pPr>
         <w:jc w:val="center"/>
         <w:rPr>
+          <w:rFonts w:ascii="Times New Roman" w:hAnsi="Times New Roman" w:cs="Times New Roman"/>
           <w:b/>
           <w:bCs/>
-        </w:rPr>
-      </w:pPr>
-      <w:r>
-        <w:rPr>
+          <w:sz w:val="32"/>
+          <w:szCs w:val="32"/>
+        </w:rPr>
+      </w:pPr>
+      <w:r>
+        <w:rPr>
+          <w:rFonts w:ascii="Times New Roman" w:hAnsi="Times New Roman" w:cs="Times New Roman"/>
           <w:b/>
           <w:bCs/>
+          <w:sz w:val="32"/>
+          <w:szCs w:val="32"/>
         </w:rPr>
         <w:t>Phase 7 – Project Documentation</w:t>
       </w:r>
@@ -21,11 +27,19 @@
     <w:p>
       <w:pPr>
         <w:jc w:val="center"/>
-      </w:pPr>
-      <w:r>
-        <w:rPr>
+        <w:rPr>
+          <w:rFonts w:ascii="Times New Roman" w:hAnsi="Times New Roman" w:cs="Times New Roman"/>
+          <w:sz w:val="32"/>
+          <w:szCs w:val="32"/>
+        </w:rPr>
+      </w:pPr>
+      <w:r>
+        <w:rPr>
+          <w:rFonts w:ascii="Times New Roman" w:hAnsi="Times New Roman" w:cs="Times New Roman"/>
           <w:b/>
           <w:bCs/>
+          <w:sz w:val="32"/>
+          <w:szCs w:val="32"/>
         </w:rPr>
         <w:t>Script-Controlled ACL – Restrict Record Access Based on Field Value</w:t>
       </w:r>
@@ -33,50 +47,94 @@
     <w:p>
       <w:pPr>
         <w:rPr>
+          <w:rFonts w:ascii="Times New Roman" w:hAnsi="Times New Roman" w:cs="Times New Roman"/>
           <w:b/>
           <w:bCs/>
-        </w:rPr>
-      </w:pPr>
-      <w:r>
-        <w:rPr>
+          <w:sz w:val="28"/>
+          <w:szCs w:val="28"/>
+        </w:rPr>
+      </w:pPr>
+      <w:r>
+        <w:rPr>
+          <w:rFonts w:ascii="Times New Roman" w:hAnsi="Times New Roman" w:cs="Times New Roman"/>
           <w:b/>
           <w:bCs/>
+          <w:sz w:val="28"/>
+          <w:szCs w:val="28"/>
         </w:rPr>
         <w:t>1. Project Overview</w:t>
       </w:r>
     </w:p>
     <w:p>
-      <w:r>
+      <w:pPr>
+        <w:rPr>
+          <w:rFonts w:ascii="Times New Roman" w:hAnsi="Times New Roman" w:cs="Times New Roman"/>
+        </w:rPr>
+      </w:pPr>
+      <w:r>
+        <w:rPr>
+          <w:rFonts w:ascii="Times New Roman" w:hAnsi="Times New Roman" w:cs="Times New Roman"/>
+        </w:rPr>
         <w:t>This lab demonstrates how script-controlled READ, WRITE, CREATE and DELETE ACLs can be used to enforce record-level security in ServiceNow.</w:t>
       </w:r>
     </w:p>
     <w:p>
-      <w:r>
+      <w:pPr>
+        <w:rPr>
+          <w:rFonts w:ascii="Times New Roman" w:hAnsi="Times New Roman" w:cs="Times New Roman"/>
+        </w:rPr>
+      </w:pPr>
+      <w:r>
+        <w:rPr>
+          <w:rFonts w:ascii="Times New Roman" w:hAnsi="Times New Roman" w:cs="Times New Roman"/>
+        </w:rPr>
         <w:t>The scenario restricts access to institution records based on user roles and the Branch field.</w:t>
       </w:r>
     </w:p>
     <w:p>
       <w:pPr>
         <w:rPr>
+          <w:rFonts w:ascii="Times New Roman" w:hAnsi="Times New Roman" w:cs="Times New Roman"/>
           <w:b/>
           <w:bCs/>
-        </w:rPr>
-      </w:pPr>
-      <w:r>
-        <w:rPr>
+          <w:sz w:val="28"/>
+          <w:szCs w:val="28"/>
+        </w:rPr>
+      </w:pPr>
+      <w:r>
+        <w:rPr>
+          <w:rFonts w:ascii="Times New Roman" w:hAnsi="Times New Roman" w:cs="Times New Roman"/>
           <w:b/>
           <w:bCs/>
+          <w:sz w:val="28"/>
+          <w:szCs w:val="28"/>
         </w:rPr>
         <w:t>2. User and Role Configuration</w:t>
       </w:r>
     </w:p>
     <w:p>
-      <w:r>
+      <w:pPr>
+        <w:rPr>
+          <w:rFonts w:ascii="Times New Roman" w:hAnsi="Times New Roman" w:cs="Times New Roman"/>
+        </w:rPr>
+      </w:pPr>
+      <w:r>
+        <w:rPr>
+          <w:rFonts w:ascii="Times New Roman" w:hAnsi="Times New Roman" w:cs="Times New Roman"/>
+        </w:rPr>
         <w:t>A test user named EEE User was created.</w:t>
       </w:r>
     </w:p>
     <w:p>
-      <w:r>
+      <w:pPr>
+        <w:rPr>
+          <w:rFonts w:ascii="Times New Roman" w:hAnsi="Times New Roman" w:cs="Times New Roman"/>
+        </w:rPr>
+      </w:pPr>
+      <w:r>
+        <w:rPr>
+          <w:rFonts w:ascii="Times New Roman" w:hAnsi="Times New Roman" w:cs="Times New Roman"/>
+        </w:rPr>
         <w:t>The following roles were created:</w:t>
       </w:r>
     </w:p>
@@ -86,8 +144,14 @@
           <w:ilvl w:val="0"/>
           <w:numId w:val="1"/>
         </w:numPr>
-      </w:pPr>
-      <w:r>
+        <w:rPr>
+          <w:rFonts w:ascii="Times New Roman" w:hAnsi="Times New Roman" w:cs="Times New Roman"/>
+        </w:rPr>
+      </w:pPr>
+      <w:r>
+        <w:rPr>
+          <w:rFonts w:ascii="Times New Roman" w:hAnsi="Times New Roman" w:cs="Times New Roman"/>
+        </w:rPr>
         <w:t>bb1</w:t>
       </w:r>
     </w:p>
@@ -97,8 +161,14 @@
           <w:ilvl w:val="0"/>
           <w:numId w:val="1"/>
         </w:numPr>
-      </w:pPr>
-      <w:r>
+        <w:rPr>
+          <w:rFonts w:ascii="Times New Roman" w:hAnsi="Times New Roman" w:cs="Times New Roman"/>
+        </w:rPr>
+      </w:pPr>
+      <w:r>
+        <w:rPr>
+          <w:rFonts w:ascii="Times New Roman" w:hAnsi="Times New Roman" w:cs="Times New Roman"/>
+        </w:rPr>
         <w:t>bb2</w:t>
       </w:r>
     </w:p>
@@ -108,8 +178,14 @@
           <w:ilvl w:val="0"/>
           <w:numId w:val="1"/>
         </w:numPr>
-      </w:pPr>
-      <w:r>
+        <w:rPr>
+          <w:rFonts w:ascii="Times New Roman" w:hAnsi="Times New Roman" w:cs="Times New Roman"/>
+        </w:rPr>
+      </w:pPr>
+      <w:r>
+        <w:rPr>
+          <w:rFonts w:ascii="Times New Roman" w:hAnsi="Times New Roman" w:cs="Times New Roman"/>
+        </w:rPr>
         <w:t>bb3</w:t>
       </w:r>
     </w:p>
@@ -119,85 +195,151 @@
           <w:ilvl w:val="0"/>
           <w:numId w:val="1"/>
         </w:numPr>
-      </w:pPr>
-      <w:r>
+        <w:rPr>
+          <w:rFonts w:ascii="Times New Roman" w:hAnsi="Times New Roman" w:cs="Times New Roman"/>
+        </w:rPr>
+      </w:pPr>
+      <w:r>
+        <w:rPr>
+          <w:rFonts w:ascii="Times New Roman" w:hAnsi="Times New Roman" w:cs="Times New Roman"/>
+        </w:rPr>
         <w:t>bb4</w:t>
       </w:r>
     </w:p>
     <w:p>
-      <w:r>
+      <w:pPr>
+        <w:rPr>
+          <w:rFonts w:ascii="Times New Roman" w:hAnsi="Times New Roman" w:cs="Times New Roman"/>
+        </w:rPr>
+      </w:pPr>
+      <w:r>
+        <w:rPr>
+          <w:rFonts w:ascii="Times New Roman" w:hAnsi="Times New Roman" w:cs="Times New Roman"/>
+        </w:rPr>
         <w:t>All roles were assigned to the EEE User.</w:t>
       </w:r>
     </w:p>
     <w:p>
       <w:pPr>
         <w:rPr>
+          <w:rFonts w:ascii="Times New Roman" w:hAnsi="Times New Roman" w:cs="Times New Roman"/>
           <w:b/>
           <w:bCs/>
-        </w:rPr>
-      </w:pPr>
-      <w:r>
-        <w:rPr>
+          <w:sz w:val="28"/>
+          <w:szCs w:val="28"/>
+        </w:rPr>
+      </w:pPr>
+      <w:r>
+        <w:rPr>
+          <w:rFonts w:ascii="Times New Roman" w:hAnsi="Times New Roman" w:cs="Times New Roman"/>
           <w:b/>
           <w:bCs/>
+          <w:sz w:val="28"/>
+          <w:szCs w:val="28"/>
         </w:rPr>
         <w:t>3. Table Documentation</w:t>
       </w:r>
     </w:p>
     <w:p>
-      <w:r>
+      <w:pPr>
+        <w:rPr>
+          <w:rFonts w:ascii="Times New Roman" w:hAnsi="Times New Roman" w:cs="Times New Roman"/>
+        </w:rPr>
+      </w:pPr>
+      <w:r>
+        <w:rPr>
+          <w:rFonts w:ascii="Times New Roman" w:hAnsi="Times New Roman" w:cs="Times New Roman"/>
+        </w:rPr>
         <w:t xml:space="preserve">A custom table named </w:t>
       </w:r>
       <w:r>
         <w:rPr>
+          <w:rFonts w:ascii="Times New Roman" w:hAnsi="Times New Roman" w:cs="Times New Roman"/>
           <w:b/>
           <w:bCs/>
         </w:rPr>
         <w:t>Institution Details</w:t>
       </w:r>
       <w:r>
+        <w:rPr>
+          <w:rFonts w:ascii="Times New Roman" w:hAnsi="Times New Roman" w:cs="Times New Roman"/>
+        </w:rPr>
         <w:t xml:space="preserve"> was created.</w:t>
       </w:r>
     </w:p>
     <w:p>
-      <w:r>
-        <w:rPr>
+      <w:pPr>
+        <w:rPr>
+          <w:rFonts w:ascii="Times New Roman" w:hAnsi="Times New Roman" w:cs="Times New Roman"/>
+        </w:rPr>
+      </w:pPr>
+      <w:r>
+        <w:rPr>
+          <w:rFonts w:ascii="Times New Roman" w:hAnsi="Times New Roman" w:cs="Times New Roman"/>
           <w:b/>
           <w:bCs/>
         </w:rPr>
         <w:t>Table name:</w:t>
       </w:r>
       <w:r>
+        <w:rPr>
+          <w:rFonts w:ascii="Times New Roman" w:hAnsi="Times New Roman" w:cs="Times New Roman"/>
+        </w:rPr>
         <w:t xml:space="preserve"> </w:t>
       </w:r>
       <w:proofErr w:type="spellStart"/>
       <w:r>
+        <w:rPr>
+          <w:rFonts w:ascii="Times New Roman" w:hAnsi="Times New Roman" w:cs="Times New Roman"/>
+        </w:rPr>
         <w:t>u_institution_details</w:t>
       </w:r>
       <w:proofErr w:type="spellEnd"/>
     </w:p>
     <w:p>
-      <w:r>
+      <w:pPr>
+        <w:rPr>
+          <w:rFonts w:ascii="Times New Roman" w:hAnsi="Times New Roman" w:cs="Times New Roman"/>
+        </w:rPr>
+      </w:pPr>
+      <w:r>
+        <w:rPr>
+          <w:rFonts w:ascii="Times New Roman" w:hAnsi="Times New Roman" w:cs="Times New Roman"/>
+        </w:rPr>
         <w:t>The table contains student, faculty, branch, email, phone number and description information.</w:t>
       </w:r>
     </w:p>
     <w:p>
       <w:pPr>
         <w:rPr>
+          <w:rFonts w:ascii="Times New Roman" w:hAnsi="Times New Roman" w:cs="Times New Roman"/>
           <w:b/>
           <w:bCs/>
-        </w:rPr>
-      </w:pPr>
-      <w:r>
-        <w:rPr>
+          <w:sz w:val="28"/>
+          <w:szCs w:val="28"/>
+        </w:rPr>
+      </w:pPr>
+      <w:r>
+        <w:rPr>
+          <w:rFonts w:ascii="Times New Roman" w:hAnsi="Times New Roman" w:cs="Times New Roman"/>
           <w:b/>
           <w:bCs/>
+          <w:sz w:val="28"/>
+          <w:szCs w:val="28"/>
         </w:rPr>
         <w:t>4. ACL Documentation</w:t>
       </w:r>
     </w:p>
     <w:p>
-      <w:r>
+      <w:pPr>
+        <w:rPr>
+          <w:rFonts w:ascii="Times New Roman" w:hAnsi="Times New Roman" w:cs="Times New Roman"/>
+        </w:rPr>
+      </w:pPr>
+      <w:r>
+        <w:rPr>
+          <w:rFonts w:ascii="Times New Roman" w:hAnsi="Times New Roman" w:cs="Times New Roman"/>
+        </w:rPr>
         <w:t>Four ACL operations were configured:</w:t>
       </w:r>
     </w:p>
@@ -207,8 +349,14 @@
           <w:ilvl w:val="0"/>
           <w:numId w:val="2"/>
         </w:numPr>
-      </w:pPr>
-      <w:r>
+        <w:rPr>
+          <w:rFonts w:ascii="Times New Roman" w:hAnsi="Times New Roman" w:cs="Times New Roman"/>
+        </w:rPr>
+      </w:pPr>
+      <w:r>
+        <w:rPr>
+          <w:rFonts w:ascii="Times New Roman" w:hAnsi="Times New Roman" w:cs="Times New Roman"/>
+        </w:rPr>
         <w:t>READ – bb1</w:t>
       </w:r>
     </w:p>
@@ -218,8 +366,14 @@
           <w:ilvl w:val="0"/>
           <w:numId w:val="2"/>
         </w:numPr>
-      </w:pPr>
-      <w:r>
+        <w:rPr>
+          <w:rFonts w:ascii="Times New Roman" w:hAnsi="Times New Roman" w:cs="Times New Roman"/>
+        </w:rPr>
+      </w:pPr>
+      <w:r>
+        <w:rPr>
+          <w:rFonts w:ascii="Times New Roman" w:hAnsi="Times New Roman" w:cs="Times New Roman"/>
+        </w:rPr>
         <w:t>CREATE – bb2</w:t>
       </w:r>
     </w:p>
@@ -229,8 +383,14 @@
           <w:ilvl w:val="0"/>
           <w:numId w:val="2"/>
         </w:numPr>
-      </w:pPr>
-      <w:r>
+        <w:rPr>
+          <w:rFonts w:ascii="Times New Roman" w:hAnsi="Times New Roman" w:cs="Times New Roman"/>
+        </w:rPr>
+      </w:pPr>
+      <w:r>
+        <w:rPr>
+          <w:rFonts w:ascii="Times New Roman" w:hAnsi="Times New Roman" w:cs="Times New Roman"/>
+        </w:rPr>
         <w:t>WRITE – bb3</w:t>
       </w:r>
     </w:p>
@@ -240,66 +400,143 @@
           <w:ilvl w:val="0"/>
           <w:numId w:val="2"/>
         </w:numPr>
-      </w:pPr>
-      <w:r>
+        <w:rPr>
+          <w:rFonts w:ascii="Times New Roman" w:hAnsi="Times New Roman" w:cs="Times New Roman"/>
+        </w:rPr>
+      </w:pPr>
+      <w:r>
+        <w:rPr>
+          <w:rFonts w:ascii="Times New Roman" w:hAnsi="Times New Roman" w:cs="Times New Roman"/>
+        </w:rPr>
         <w:t>DELETE – bb4</w:t>
       </w:r>
     </w:p>
     <w:p>
-      <w:r>
+      <w:pPr>
+        <w:rPr>
+          <w:rFonts w:ascii="Times New Roman" w:hAnsi="Times New Roman" w:cs="Times New Roman"/>
+        </w:rPr>
+      </w:pPr>
+      <w:r>
+        <w:rPr>
+          <w:rFonts w:ascii="Times New Roman" w:hAnsi="Times New Roman" w:cs="Times New Roman"/>
+        </w:rPr>
         <w:t>The READ ACL also contains the condition that Branch is EEE.</w:t>
       </w:r>
     </w:p>
-    <w:p/>
-    <w:p/>
-    <w:p>
-      <w:pPr>
-        <w:rPr>
+    <w:p>
+      <w:pPr>
+        <w:rPr>
+          <w:rFonts w:ascii="Times New Roman" w:hAnsi="Times New Roman" w:cs="Times New Roman"/>
+        </w:rPr>
+      </w:pPr>
+    </w:p>
+    <w:p>
+      <w:pPr>
+        <w:rPr>
+          <w:rFonts w:ascii="Times New Roman" w:hAnsi="Times New Roman" w:cs="Times New Roman"/>
+        </w:rPr>
+      </w:pPr>
+    </w:p>
+    <w:p>
+      <w:pPr>
+        <w:rPr>
+          <w:rFonts w:ascii="Times New Roman" w:hAnsi="Times New Roman" w:cs="Times New Roman"/>
+        </w:rPr>
+      </w:pPr>
+    </w:p>
+    <w:p>
+      <w:pPr>
+        <w:rPr>
+          <w:rFonts w:ascii="Times New Roman" w:hAnsi="Times New Roman" w:cs="Times New Roman"/>
           <w:b/>
           <w:bCs/>
-        </w:rPr>
-      </w:pPr>
-      <w:r>
-        <w:rPr>
+          <w:sz w:val="28"/>
+          <w:szCs w:val="28"/>
+        </w:rPr>
+      </w:pPr>
+      <w:r>
+        <w:rPr>
+          <w:rFonts w:ascii="Times New Roman" w:hAnsi="Times New Roman" w:cs="Times New Roman"/>
           <w:b/>
           <w:bCs/>
+          <w:sz w:val="28"/>
+          <w:szCs w:val="28"/>
         </w:rPr>
         <w:lastRenderedPageBreak/>
         <w:t>5. Script Documentation</w:t>
       </w:r>
     </w:p>
     <w:p>
-      <w:r>
+      <w:pPr>
+        <w:rPr>
+          <w:rFonts w:ascii="Times New Roman" w:hAnsi="Times New Roman" w:cs="Times New Roman"/>
+        </w:rPr>
+      </w:pPr>
+      <w:r>
+        <w:rPr>
+          <w:rFonts w:ascii="Times New Roman" w:hAnsi="Times New Roman" w:cs="Times New Roman"/>
+        </w:rPr>
         <w:t>The READ ACL script checks the user's role.</w:t>
       </w:r>
     </w:p>
     <w:p>
-      <w:r>
+      <w:pPr>
+        <w:rPr>
+          <w:rFonts w:ascii="Times New Roman" w:hAnsi="Times New Roman" w:cs="Times New Roman"/>
+        </w:rPr>
+      </w:pPr>
+      <w:r>
+        <w:rPr>
+          <w:rFonts w:ascii="Times New Roman" w:hAnsi="Times New Roman" w:cs="Times New Roman"/>
+        </w:rPr>
         <w:t>Administrators are allowed full access. Users with the bb1 role are allowed by the script, while other users are denied.</w:t>
       </w:r>
     </w:p>
     <w:p>
       <w:pPr>
         <w:rPr>
+          <w:rFonts w:ascii="Times New Roman" w:hAnsi="Times New Roman" w:cs="Times New Roman"/>
           <w:b/>
           <w:bCs/>
-        </w:rPr>
-      </w:pPr>
-      <w:r>
-        <w:rPr>
+          <w:sz w:val="28"/>
+          <w:szCs w:val="28"/>
+        </w:rPr>
+      </w:pPr>
+      <w:r>
+        <w:rPr>
+          <w:rFonts w:ascii="Times New Roman" w:hAnsi="Times New Roman" w:cs="Times New Roman"/>
           <w:b/>
           <w:bCs/>
+          <w:sz w:val="28"/>
+          <w:szCs w:val="28"/>
         </w:rPr>
         <w:t>6. Testing Documentation</w:t>
       </w:r>
     </w:p>
     <w:p>
-      <w:r>
+      <w:pPr>
+        <w:rPr>
+          <w:rFonts w:ascii="Times New Roman" w:hAnsi="Times New Roman" w:cs="Times New Roman"/>
+        </w:rPr>
+      </w:pPr>
+      <w:r>
+        <w:rPr>
+          <w:rFonts w:ascii="Times New Roman" w:hAnsi="Times New Roman" w:cs="Times New Roman"/>
+        </w:rPr>
         <w:t>The ACLs were tested using user impersonation.</w:t>
       </w:r>
     </w:p>
     <w:p>
-      <w:r>
+      <w:pPr>
+        <w:rPr>
+          <w:rFonts w:ascii="Times New Roman" w:hAnsi="Times New Roman" w:cs="Times New Roman"/>
+        </w:rPr>
+      </w:pPr>
+      <w:r>
+        <w:rPr>
+          <w:rFonts w:ascii="Times New Roman" w:hAnsi="Times New Roman" w:cs="Times New Roman"/>
+        </w:rPr>
         <w:t>Testing included:</w:t>
       </w:r>
     </w:p>
@@ -309,8 +546,14 @@
           <w:ilvl w:val="0"/>
           <w:numId w:val="3"/>
         </w:numPr>
-      </w:pPr>
-      <w:r>
+        <w:rPr>
+          <w:rFonts w:ascii="Times New Roman" w:hAnsi="Times New Roman" w:cs="Times New Roman"/>
+        </w:rPr>
+      </w:pPr>
+      <w:r>
+        <w:rPr>
+          <w:rFonts w:ascii="Times New Roman" w:hAnsi="Times New Roman" w:cs="Times New Roman"/>
+        </w:rPr>
         <w:t>Viewing records</w:t>
       </w:r>
     </w:p>
@@ -320,8 +563,14 @@
           <w:ilvl w:val="0"/>
           <w:numId w:val="3"/>
         </w:numPr>
-      </w:pPr>
-      <w:r>
+        <w:rPr>
+          <w:rFonts w:ascii="Times New Roman" w:hAnsi="Times New Roman" w:cs="Times New Roman"/>
+        </w:rPr>
+      </w:pPr>
+      <w:r>
+        <w:rPr>
+          <w:rFonts w:ascii="Times New Roman" w:hAnsi="Times New Roman" w:cs="Times New Roman"/>
+        </w:rPr>
         <w:t>Creating records</w:t>
       </w:r>
     </w:p>
@@ -331,8 +580,14 @@
           <w:ilvl w:val="0"/>
           <w:numId w:val="3"/>
         </w:numPr>
-      </w:pPr>
-      <w:r>
+        <w:rPr>
+          <w:rFonts w:ascii="Times New Roman" w:hAnsi="Times New Roman" w:cs="Times New Roman"/>
+        </w:rPr>
+      </w:pPr>
+      <w:r>
+        <w:rPr>
+          <w:rFonts w:ascii="Times New Roman" w:hAnsi="Times New Roman" w:cs="Times New Roman"/>
+        </w:rPr>
         <w:t>Editing records</w:t>
       </w:r>
     </w:p>
@@ -342,8 +597,14 @@
           <w:ilvl w:val="0"/>
           <w:numId w:val="3"/>
         </w:numPr>
-      </w:pPr>
-      <w:r>
+        <w:rPr>
+          <w:rFonts w:ascii="Times New Roman" w:hAnsi="Times New Roman" w:cs="Times New Roman"/>
+        </w:rPr>
+      </w:pPr>
+      <w:r>
+        <w:rPr>
+          <w:rFonts w:ascii="Times New Roman" w:hAnsi="Times New Roman" w:cs="Times New Roman"/>
+        </w:rPr>
         <w:t>Deleting records</w:t>
       </w:r>
     </w:p>
@@ -353,52 +614,92 @@
           <w:ilvl w:val="0"/>
           <w:numId w:val="3"/>
         </w:numPr>
-      </w:pPr>
-      <w:r>
+        <w:rPr>
+          <w:rFonts w:ascii="Times New Roman" w:hAnsi="Times New Roman" w:cs="Times New Roman"/>
+        </w:rPr>
+      </w:pPr>
+      <w:r>
+        <w:rPr>
+          <w:rFonts w:ascii="Times New Roman" w:hAnsi="Times New Roman" w:cs="Times New Roman"/>
+        </w:rPr>
         <w:t>Checking administrator access</w:t>
       </w:r>
     </w:p>
     <w:p>
       <w:pPr>
         <w:rPr>
+          <w:rFonts w:ascii="Times New Roman" w:hAnsi="Times New Roman" w:cs="Times New Roman"/>
           <w:b/>
           <w:bCs/>
-        </w:rPr>
-      </w:pPr>
-      <w:r>
-        <w:rPr>
+          <w:sz w:val="28"/>
+          <w:szCs w:val="28"/>
+        </w:rPr>
+      </w:pPr>
+      <w:r>
+        <w:rPr>
+          <w:rFonts w:ascii="Times New Roman" w:hAnsi="Times New Roman" w:cs="Times New Roman"/>
           <w:b/>
           <w:bCs/>
+          <w:sz w:val="28"/>
+          <w:szCs w:val="28"/>
         </w:rPr>
         <w:t>7. Security Outcome</w:t>
       </w:r>
     </w:p>
     <w:p>
-      <w:r>
+      <w:pPr>
+        <w:rPr>
+          <w:rFonts w:ascii="Times New Roman" w:hAnsi="Times New Roman" w:cs="Times New Roman"/>
+        </w:rPr>
+      </w:pPr>
+      <w:r>
+        <w:rPr>
+          <w:rFonts w:ascii="Times New Roman" w:hAnsi="Times New Roman" w:cs="Times New Roman"/>
+        </w:rPr>
         <w:t>The project demonstrates how ACLs can be used to protect records from unauthorized access and control different operations based on user roles and record conditions.</w:t>
       </w:r>
     </w:p>
     <w:p>
       <w:pPr>
         <w:rPr>
+          <w:rFonts w:ascii="Times New Roman" w:hAnsi="Times New Roman" w:cs="Times New Roman"/>
           <w:b/>
           <w:bCs/>
-        </w:rPr>
-      </w:pPr>
-      <w:r>
-        <w:rPr>
+          <w:sz w:val="28"/>
+          <w:szCs w:val="28"/>
+        </w:rPr>
+      </w:pPr>
+      <w:r>
+        <w:rPr>
+          <w:rFonts w:ascii="Times New Roman" w:hAnsi="Times New Roman" w:cs="Times New Roman"/>
           <w:b/>
           <w:bCs/>
+          <w:sz w:val="28"/>
+          <w:szCs w:val="28"/>
         </w:rPr>
         <w:t>8. Supporting Evidence</w:t>
       </w:r>
     </w:p>
     <w:p>
-      <w:r>
+      <w:pPr>
+        <w:rPr>
+          <w:rFonts w:ascii="Times New Roman" w:hAnsi="Times New Roman" w:cs="Times New Roman"/>
+        </w:rPr>
+      </w:pPr>
+      <w:r>
+        <w:rPr>
+          <w:rFonts w:ascii="Times New Roman" w:hAnsi="Times New Roman" w:cs="Times New Roman"/>
+        </w:rPr>
         <w:t>Development screenshots should be maintained in Phase 5 and testing screenshots should be maintained in Phase 6.</w:t>
       </w:r>
     </w:p>
-    <w:p/>
+    <w:p>
+      <w:pPr>
+        <w:rPr>
+          <w:rFonts w:ascii="Times New Roman" w:hAnsi="Times New Roman" w:cs="Times New Roman"/>
+        </w:rPr>
+      </w:pPr>
+    </w:p>
     <w:sectPr>
       <w:pgSz w:w="11906" w:h="16838"/>
       <w:pgMar w:top="1440" w:right="1440" w:bottom="1440" w:left="1440" w:header="708" w:footer="708" w:gutter="0"/>
@@ -1473,6 +1774,7 @@
   <w:style w:type="character" w:default="1" w:styleId="DefaultParagraphFont">
     <w:name w:val="Default Paragraph Font"/>
     <w:uiPriority w:val="1"/>
+    <w:semiHidden/>
     <w:unhideWhenUsed/>
   </w:style>
   <w:style w:type="table" w:default="1" w:styleId="TableNormal">

</xml_diff>